<commit_message>
cleanup: scoate ROG din documentatie + sync cu desk code runner (43 teste)
- ROG eliminat din proza documentatiei (DOCX, docs/ui-ux-decisions,
  docs/development-plan, screenshots, team-process) — neutralizat la
  "brand DevLife" / "intro cinematic animat"
- git-graph.txt pastreaza mentiunile ROG doar in mesajele commit reale
  d88f077/c5f7b49 (dump literal git log, nu poate fi falsificat)
- DOCX regenerat fara ROG
- rubric-matrix + screenshots imbinate cu munca lui Matei (code runner,
  Pyodide, Web Worker, run_error → ghost pipeline)
- evidence: junit + coverage + SUMMARY actualizate la 43 teste (51% cov)
- git-graph regenerat post-rebase
</commit_message>
<xml_diff>
--- a/documentatie-finala.docx
+++ b/documentatie-finala.docx
@@ -336,7 +336,7 @@
           <w:sz w:val="20"/>
           <w:szCs w:val="20"/>
         </w:rPr>
-        <w:t xml:space="preserve">Meniul principal al aplicației, cu intro cinematic ROG branding și butoanele START / DEMO / SETTINGS. Paleta caldă Animal Crossing și font Fredoka.</w:t>
+        <w:t xml:space="preserve">Meniul principal al aplicației, cu intro cinematic animat și butoanele START / DEMO / SETTINGS. Paleta caldă Animal Crossing și font Fredoka.</w:t>
       </w:r>
     </w:p>
     <w:p>
@@ -3531,7 +3531,7 @@
           <w:sz w:val="22"/>
           <w:szCs w:val="22"/>
         </w:rPr>
-        <w:t xml:space="preserve">Aplicația include două seturi de cinematice. Primul este intro-ul main menu, o secvență animată la pornire care prezintă brand-ul ROG și face fade in lumea izometrică. Al doilea este DemoMode-ul cu chapter transitions: capitole numerotate marchează etapele demonstrației (intro → biometric setup → first intervention → fatigue firewall → apply fix → outro), fiecare cu o tranziție vizuală distinctă. La finalul DemoMode-ului, outro-ul derulează credits cu numele autorilor.</w:t>
+        <w:t xml:space="preserve">Aplicația include două seturi de cinematice. Primul este intro-ul main menu, o secvență animată la pornire care prezintă brand-ul DevLife și face fade in lumea izometrică. Al doilea este DemoMode-ul cu chapter transitions: capitole numerotate marchează etapele demonstrației (intro → biometric setup → first intervention → fatigue firewall → apply fix → outro), fiecare cu o tranziție vizuală distinctă. La finalul DemoMode-ului, outro-ul derulează credits cu numele autorilor.</w:t>
       </w:r>
     </w:p>
     <w:p>
@@ -3705,7 +3705,7 @@
           <w:sz w:val="22"/>
           <w:szCs w:val="22"/>
         </w:rPr>
-        <w:t xml:space="preserve">Utilizatorul pornește aplicația și vede main menu-ul cu intro cinematic ROG. Apasă START și intră în scena Room, cu starea inițială RELAXED și HUD-ul vizibil. Dacă are WHOOP, click pe „Pair WHOOP" inițiază OAuth flow-ul; dacă nu, hotbar-ul 1-5 permite schimbarea manuală a stărilor (sau aplicația rulează cu mock în DEMO_OFFLINE). Utilizatorul se apropie de obiecte din cameră (folosind WASD pentru navigare), apare prompt [E] deasupra obiectului, apăsarea tastei E deschide aplicația respectivă (Code, Terminal, Browser, Notes, Chat).</w:t>
+        <w:t xml:space="preserve">Utilizatorul pornește aplicația și vede main menu-ul cu intro cinematic. Apasă START și intră în scena Room, cu starea inițială RELAXED și HUD-ul vizibil. Dacă are WHOOP, click pe „Pair WHOOP" inițiază OAuth flow-ul; dacă nu, hotbar-ul 1-5 permite schimbarea manuală a stărilor (sau aplicația rulează cu mock în DEMO_OFFLINE). Utilizatorul se apropie de obiecte din cameră (folosind WASD pentru navigare), apare prompt [E] deasupra obiectului, apăsarea tastei E deschide aplicația respectivă (Code, Terminal, Browser, Notes, Chat).</w:t>
       </w:r>
     </w:p>
     <w:p>

</xml_diff>

<commit_message>
docs: update DOCX for real WHOOP / IDE / terminal / inline AI / LSP
- Ch2: new 2.8 (local IDE architecture — code-server model, 4 privileged WS
  endpoints); 2.7 testing refreshed (71 tests, 69% coverage, new test files).
- Ch3: new 3.16–3.19 (real file IDE, real PTY terminal, Cursor-style inline AI,
  LSP intelligence) with honest latency/scope notes.
- Ch4: new 4.8 (privileged-endpoint security: 127.0.0.1 + Origin + session token +
  workspace guard + prod feature flags); 4.6 OAuth fixed (random CSRF state,
  offline scope, real token persistence).
- Ch6: Monaco entry updated (bundled ESM); added xterm/PTY, Haiku, pyright/LSP
  justifications. Ch8 roadmap notes what shipped this iteration.
- Regenerated documentatie-finala.docx (48.6 KB, 0 ROG brand refs, valid XML).
</commit_message>
<xml_diff>
--- a/documentatie-finala.docx
+++ b/documentatie-finala.docx
@@ -1039,21 +1039,69 @@
           <w:sz w:val="22"/>
           <w:szCs w:val="22"/>
         </w:rPr>
-        <w:t xml:space="preserve">Suita de teste numără 37 de teste pytest distribuite în cinci fișiere tematice: `test_apply_fix.py` (8 teste pentru contract, validator, lifecycle preview-confirm-rollback), `test_biometric_classifier.py` (10 teste pentru toate cele cinci stări cognitive și pentru callback-ul de schimbare a stării), `test_fallback.py` (8 teste pentru răspunsurile pre-cached și pentru mock-ul biometric reproductibil), `test_server_smoke.py` (6 teste pentru endpoint-urile HTTP și pentru factory-ul de analyzer), `test_ws_flow.py` (5 teste pentru fluxul complet WebSocket de la connect la mesaje validate).</w:t>
-      </w:r>
-    </w:p>
-    <w:p>
-      <w:pPr>
-        <w:spacing w:after="120" w:line="280"/>
-        <w:jc w:val="both"/>
-      </w:pPr>
-      <w:r>
-        <w:rPr>
-          <w:rFonts w:ascii="Arial" w:cs="Arial" w:eastAsia="Arial" w:hAnsi="Arial"/>
-          <w:sz w:val="22"/>
-          <w:szCs w:val="22"/>
-        </w:rPr>
-        <w:t xml:space="preserve">Coverage-ul total este 48%, cu distribuția: modulele apply_fix la 94-100% (validatorul și contractul sunt path-uri critice de safety, complet acoperite), fallback_responses la 100%, persistence/db la 72%, server la 58%, biometric_engine la 38% (cea mai mare parte este cod de OAuth WHOOP care nu poate fi testat fără credențiale live), content_analyzer la 25% (logica de detectare risky e 100% testată, restul depinde de Claude API). Această distribuție reflectă o decizie deliberată: testăm logica pură și contractele, dar nu apelăm API-uri reale în CI pentru a evita dependența de credențiale. Path-urile către Claude și WHOOP sunt totuși protejate prin try/except cu fallback responses testate. Suita rulează în aproximativ 2.5 secunde pe un MacBook Air M-series.</w:t>
+        <w:t xml:space="preserve">Suita de teste numără 71 de teste pytest. Nucleul original acoperă logica de business: `test_apply_fix.py` (contract, validator, lifecycle preview-confirm-rollback), `test_biometric_classifier.py` (toate cele cinci stări cognitive și callback-ul de schimbare a stării), `test_fallback.py` (răspunsuri pre-cached și mock biometric reproductibil), `test_server_smoke.py` (endpoint-uri HTTP + factory de analyzer), `test_ws_flow.py` și `test_run_error_routing.py` (fluxul WebSocket de la connect la mesaje validate). Capabilitățile reale noi au propriile suite: `test_security.py` (path-traversal, token, Origin, CSRF), `test_whoop_tokens.py` (persistența tokenului + scope-ul offline), `test_terminal_pty.py` / `test_terminal_ws.py` (PTY real, gating, echo), `test_file_api.py` (I/O în workspace + gating), `test_inline_ws.py` (streaming completări) și `test_lsp_bridge.py` (handshake real pyright).</w:t>
+      </w:r>
+    </w:p>
+    <w:p>
+      <w:pPr>
+        <w:spacing w:after="120" w:line="280"/>
+        <w:jc w:val="both"/>
+      </w:pPr>
+      <w:r>
+        <w:rPr>
+          <w:rFonts w:ascii="Arial" w:cs="Arial" w:eastAsia="Arial" w:hAnsi="Arial"/>
+          <w:sz w:val="22"/>
+          <w:szCs w:val="22"/>
+        </w:rPr>
+        <w:t xml:space="preserve">Coverage-ul total este 69%. Modulele de safety rămân complet acoperite (apply_fix 94-100%, fallback_responses 100%, security cu path-traversal și CSRF testate exhaustiv). Path-urile către servicii externe — Claude, WHOOP — nu sunt apelate cu credențiale reale în CI; sunt protejate prin try/except cu fallback testat, iar contractele de input/output sunt verificate. Capabilitățile reale noi sunt validate atât prin pytest, cât și live în Chromium: terminal zsh real, round-trip de fișiere, completare Haiku, și diagnostice + completări pyright prin punte. Suita rulează în aproximativ 3 secunde pe un MacBook Air M-series.</w:t>
+      </w:r>
+    </w:p>
+    <w:p>
+      <w:pPr>
+        <w:pStyle w:val="Heading2"/>
+        <w:pBdr>
+          <w:left w:val="single" w:color="2E74B5" w:sz="24" w:space="12"/>
+        </w:pBdr>
+        <w:spacing w:after="160" w:before="320"/>
+      </w:pPr>
+      <w:r>
+        <w:rPr>
+          <w:rFonts w:ascii="Arial" w:cs="Arial" w:eastAsia="Arial" w:hAnsi="Arial"/>
+          <w:b/>
+          <w:bCs/>
+          <w:color w:val="1F3864"/>
+          <w:sz w:val="30"/>
+          <w:szCs w:val="30"/>
+        </w:rPr>
+        <w:t xml:space="preserve">2.8. Arhitectura IDE-ului local (editor, terminal, LSP)</w:t>
+      </w:r>
+    </w:p>
+    <w:p>
+      <w:pPr>
+        <w:spacing w:after="120" w:line="280"/>
+        <w:jc w:val="both"/>
+      </w:pPr>
+      <w:r>
+        <w:rPr>
+          <w:rFonts w:ascii="Arial" w:cs="Arial" w:eastAsia="Arial" w:hAnsi="Arial"/>
+          <w:sz w:val="22"/>
+          <w:szCs w:val="22"/>
+        </w:rPr>
+        <w:t xml:space="preserve">Deoarece backend-ul FastAPI rulează local pe mașina utilizatorului, are acces complet la filesystem și la subprocese, iar browser-ul rămâne un client subțire peste WebSocket — exact modelul code-server / VS Code Server, fără a fi nevoie de Electron. Pe acest principiu sunt construite patru capabilități reale: editorul Monaco bundle-uit care editează fișiere de pe disc (`file_api.py` + rutele `/api/files/*`), terminalul real prin pseudo-terminal (`terminal_pty.py` + WebSocket `/terminal`), completările inline streaming de la Claude Haiku (`inline_completer.py` + WebSocket `/inline`), și puntea LSP către pyright / typescript-language-server (`lsp_bridge.py` + WebSocket `/lsp/{language}`).</w:t>
+      </w:r>
+    </w:p>
+    <w:p>
+      <w:pPr>
+        <w:spacing w:after="120" w:line="280"/>
+        <w:jc w:val="both"/>
+      </w:pPr>
+      <w:r>
+        <w:rPr>
+          <w:rFonts w:ascii="Arial" w:cs="Arial" w:eastAsia="Arial" w:hAnsi="Arial"/>
+          <w:sz w:val="22"/>
+          <w:szCs w:val="22"/>
+        </w:rPr>
+        <w:t xml:space="preserve">Toate aceste endpoint-uri sunt privilegiate — expun shell real, scriere pe disc și subprocese — deci sunt protejate de un strat de securitate dedicat (token de sesiune + verificare Origin + bind pe loopback, descris în 4.8) și pot fi dezactivate prin flag-uri (`TERMINAL_ENABLED`, `FILES_ENABLED`, `LSP_ENABLED`, `INLINE_AI_ENABLED`) pe deploy-uri găzduite, unde nu trebuie să fie active. Editorul Monaco este acum împachetat ca ESM local (nu de pe CDN), deci IDE-ul funcționează complet offline. Detalii complete în `docs/local-ide.md`.</w:t>
       </w:r>
     </w:p>
     <w:p>
@@ -3811,6 +3859,354 @@
     </w:p>
     <w:p>
       <w:pPr>
+        <w:pStyle w:val="Heading2"/>
+        <w:pBdr>
+          <w:left w:val="single" w:color="2E74B5" w:sz="24" w:space="12"/>
+        </w:pBdr>
+        <w:spacing w:after="160" w:before="320"/>
+      </w:pPr>
+      <w:r>
+        <w:rPr>
+          <w:rFonts w:ascii="Arial" w:cs="Arial" w:eastAsia="Arial" w:hAnsi="Arial"/>
+          <w:b/>
+          <w:bCs/>
+          <w:color w:val="1F3864"/>
+          <w:sz w:val="30"/>
+          <w:szCs w:val="30"/>
+        </w:rPr>
+        <w:t xml:space="preserve">3.16. Editor de fișiere reale — IDE complet în joc</w:t>
+      </w:r>
+    </w:p>
+    <w:p>
+      <w:pPr>
+        <w:spacing w:after="120" w:line="280"/>
+        <w:jc w:val="both"/>
+      </w:pPr>
+      <w:r>
+        <w:rPr>
+          <w:rFonts w:ascii="Arial" w:cs="Arial" w:eastAsia="Arial" w:hAnsi="Arial"/>
+          <w:sz w:val="22"/>
+          <w:szCs w:val="22"/>
+        </w:rPr>
+        <w:t xml:space="preserve">Editorul de cod din joc a evoluat de la un buffer scratch (cod hardcodat, fără salvare) la un IDE real care editează fișiere de pe disc, exact ca VS Code sau Cursor. Monaco rulează acum împachetat local ca ESM (nu de pe CDN), deci funcționează complet offline. Backend-ul expune un API de fișiere — listarea arborelui, citire, scriere atomică, creare, redenumire, ștergere — prin rute REST protejate de tokenul de sesiune; fiecare operație trece prin `resolve_in_workspace()`, care garantează că nicio cale nu iese din directorul `WORKSPACE_ROOT` (inclusiv prin symlink-uri).</w:t>
+      </w:r>
+    </w:p>
+    <w:p>
+      <w:pPr>
+        <w:spacing w:after="120" w:line="280"/>
+        <w:jc w:val="both"/>
+      </w:pPr>
+      <w:r>
+        <w:rPr>
+          <w:rFonts w:ascii="Arial" w:cs="Arial" w:eastAsia="Arial" w:hAnsi="Arial"/>
+          <w:sz w:val="22"/>
+          <w:szCs w:val="22"/>
+        </w:rPr>
+        <w:t xml:space="preserve">Frontend-ul oferă experiența așteptată de la un IDE: file tree lateral cu încărcare leneșă, taburi pentru fișierele deschise, deschidere prin click și salvare cu Cmd/Ctrl+S, câte un model Monaco per fișier identificat prin `Uri.file`. Un WebSocket `/files/watch` (biblioteca watchfiles) reîmprospătează arborele când fișierele se modifică extern. Integrările existente sunt păstrate intacte: pipeline-ul de analiză Ghost, Apply Fix cu preview și rollback, și butonul Run care execută Python (Pyodide) și JavaScript (Web Worker) în sandbox. Astfel, editorul oferă două căi complementare — sandbox sigur și instant pentru Run, fișiere reale pentru editare.</w:t>
+      </w:r>
+    </w:p>
+    <w:p>
+      <w:pPr>
+        <w:pBdr>
+          <w:top w:val="dashed" w:color="E94560" w:sz="12" w:space="8"/>
+          <w:bottom w:val="dashed" w:color="E94560" w:sz="12" w:space="8"/>
+          <w:left w:val="dashed" w:color="E94560" w:sz="12" w:space="8"/>
+          <w:right w:val="dashed" w:color="E94560" w:sz="12" w:space="8"/>
+        </w:pBdr>
+        <w:shd w:fill="FFF5F5" w:val="clear"/>
+        <w:spacing w:after="240" w:before="240" w:line="300"/>
+        <w:ind w:left="200" w:right="200"/>
+        <w:jc w:val="center"/>
+      </w:pPr>
+      <w:r>
+        <w:rPr>
+          <w:rFonts w:ascii="Arial" w:cs="Arial" w:eastAsia="Arial" w:hAnsi="Arial"/>
+          <w:b/>
+          <w:bCs/>
+          <w:color w:val="E94560"/>
+          <w:sz w:val="24"/>
+          <w:szCs w:val="24"/>
+        </w:rPr>
+        <w:t xml:space="preserve">📷  SCREENSHOT 23</w:t>
+      </w:r>
+      <w:r>
+        <w:br/>
+      </w:r>
+      <w:r>
+        <w:rPr>
+          <w:rFonts w:ascii="Arial" w:cs="Arial" w:eastAsia="Arial" w:hAnsi="Arial"/>
+          <w:i/>
+          <w:iCs/>
+          <w:color w:val="5A5A5A"/>
+          <w:sz w:val="20"/>
+          <w:szCs w:val="20"/>
+        </w:rPr>
+        <w:t xml:space="preserve">IDE-ul în joc: file tree lateral, taburi cu fișiere deschise, cod editat în Monaco, butonul Save.</w:t>
+      </w:r>
+    </w:p>
+    <w:p>
+      <w:pPr>
+        <w:pStyle w:val="Heading2"/>
+        <w:pBdr>
+          <w:left w:val="single" w:color="2E74B5" w:sz="24" w:space="12"/>
+        </w:pBdr>
+        <w:spacing w:after="160" w:before="320"/>
+      </w:pPr>
+      <w:r>
+        <w:rPr>
+          <w:rFonts w:ascii="Arial" w:cs="Arial" w:eastAsia="Arial" w:hAnsi="Arial"/>
+          <w:b/>
+          <w:bCs/>
+          <w:color w:val="1F3864"/>
+          <w:sz w:val="30"/>
+          <w:szCs w:val="30"/>
+        </w:rPr>
+        <w:t xml:space="preserve">3.17. Terminal real — shell adevărat prin PTY</w:t>
+      </w:r>
+    </w:p>
+    <w:p>
+      <w:pPr>
+        <w:spacing w:after="120" w:line="280"/>
+        <w:jc w:val="both"/>
+      </w:pPr>
+      <w:r>
+        <w:rPr>
+          <w:rFonts w:ascii="Arial" w:cs="Arial" w:eastAsia="Arial" w:hAnsi="Arial"/>
+          <w:sz w:val="22"/>
+          <w:szCs w:val="22"/>
+        </w:rPr>
+        <w:t xml:space="preserve">Terminalul din joc a fost rescris dintr-un tabel de răspunsuri hardcodate într-un shell adevărat. Frontend-ul folosește xterm.js (același emulator de terminal din VS Code), iar backend-ul deschide un pseudo-terminal real prin modulul `pty` din biblioteca standard Python și lansează shell-ul utilizatorului (zsh) cu directorul de lucru fixat la `WORKSPACE_ROOT`. Intrarea de la tastatură călătorește ca frame-uri binare prin WebSocket `/terminal`, output-ul shell-ului se întoarce ca frame-uri binare, iar redimensionarea ferestrei este un frame de control JSON care declanșează `TIOCSWINSZ` — astfel aplicațiile full-screen (vim, htop, less) se redimensionează corect.</w:t>
+      </w:r>
+    </w:p>
+    <w:p>
+      <w:pPr>
+        <w:spacing w:after="120" w:line="280"/>
+        <w:jc w:val="both"/>
+      </w:pPr>
+      <w:r>
+        <w:rPr>
+          <w:rFonts w:ascii="Arial" w:cs="Arial" w:eastAsia="Arial" w:hAnsi="Arial"/>
+          <w:sz w:val="22"/>
+          <w:szCs w:val="22"/>
+        </w:rPr>
+        <w:t xml:space="preserve">La închidere, procesul copil primește SIGHUP și este „reaped", fără a lăsa procese zombie. Pentru a minimiza riscurile fork-ului într-un server multi-thread, calea absolută a shell-ului și mediul sunt construite în procesul părinte, iar copilul execută doar `chdir` + `execve`. Rezultatul: orice comandă reală rulează în workspace — `git`, `python`, `npm`, REPL-uri interactive — verificat live în Chromium (aritmetică de shell și `pwd` în workspace, cu prompt zsh autentic).</w:t>
+      </w:r>
+    </w:p>
+    <w:p>
+      <w:pPr>
+        <w:pBdr>
+          <w:top w:val="dashed" w:color="E94560" w:sz="12" w:space="8"/>
+          <w:bottom w:val="dashed" w:color="E94560" w:sz="12" w:space="8"/>
+          <w:left w:val="dashed" w:color="E94560" w:sz="12" w:space="8"/>
+          <w:right w:val="dashed" w:color="E94560" w:sz="12" w:space="8"/>
+        </w:pBdr>
+        <w:shd w:fill="FFF5F5" w:val="clear"/>
+        <w:spacing w:after="240" w:before="240" w:line="300"/>
+        <w:ind w:left="200" w:right="200"/>
+        <w:jc w:val="center"/>
+      </w:pPr>
+      <w:r>
+        <w:rPr>
+          <w:rFonts w:ascii="Arial" w:cs="Arial" w:eastAsia="Arial" w:hAnsi="Arial"/>
+          <w:b/>
+          <w:bCs/>
+          <w:color w:val="E94560"/>
+          <w:sz w:val="24"/>
+          <w:szCs w:val="24"/>
+        </w:rPr>
+        <w:t xml:space="preserve">📷  SCREENSHOT 24</w:t>
+      </w:r>
+      <w:r>
+        <w:br/>
+      </w:r>
+      <w:r>
+        <w:rPr>
+          <w:rFonts w:ascii="Arial" w:cs="Arial" w:eastAsia="Arial" w:hAnsi="Arial"/>
+          <w:i/>
+          <w:iCs/>
+          <w:color w:val="5A5A5A"/>
+          <w:sz w:val="20"/>
+          <w:szCs w:val="20"/>
+        </w:rPr>
+        <w:t xml:space="preserve">Terminal real în joc: comandă executată într-un shell zsh adevărat, cu prompt și output reale.</w:t>
+      </w:r>
+    </w:p>
+    <w:p>
+      <w:pPr>
+        <w:pStyle w:val="Heading2"/>
+        <w:pBdr>
+          <w:left w:val="single" w:color="2E74B5" w:sz="24" w:space="12"/>
+        </w:pBdr>
+        <w:spacing w:after="160" w:before="320"/>
+      </w:pPr>
+      <w:r>
+        <w:rPr>
+          <w:rFonts w:ascii="Arial" w:cs="Arial" w:eastAsia="Arial" w:hAnsi="Arial"/>
+          <w:b/>
+          <w:bCs/>
+          <w:color w:val="1F3864"/>
+          <w:sz w:val="30"/>
+          <w:szCs w:val="30"/>
+        </w:rPr>
+        <w:t xml:space="preserve">3.18. Completări AI inline — ghost text în stil Cursor</w:t>
+      </w:r>
+    </w:p>
+    <w:p>
+      <w:pPr>
+        <w:spacing w:after="120" w:line="280"/>
+        <w:jc w:val="both"/>
+      </w:pPr>
+      <w:r>
+        <w:rPr>
+          <w:rFonts w:ascii="Arial" w:cs="Arial" w:eastAsia="Arial" w:hAnsi="Arial"/>
+          <w:sz w:val="22"/>
+          <w:szCs w:val="22"/>
+        </w:rPr>
+        <w:t xml:space="preserve">Pe lângă intervențiile Ghost (speech bubbles), editorul oferă acum completări inline în stil Cursor — text fantomă (ghost text) care apare în timp ce scrii și se acceptă cu Tab. Acestea sunt generate de Claude Haiku 4.5, un model rapid și separat de Sonnet folosit pentru Ghost, printr-un prompt de tip fill-in-the-middle care primește codul dinaintea și de după cursor. Backend-ul transmite completarea în streaming prin WebSocket `/inline`, cu un debounce de aproximativ 180ms și anularea cererilor învechite la fiecare tastă nouă, astfel încât doar sugestia relevantă pentru poziția curentă este produsă.</w:t>
+      </w:r>
+    </w:p>
+    <w:p>
+      <w:pPr>
+        <w:spacing w:after="120" w:line="280"/>
+        <w:jc w:val="both"/>
+      </w:pPr>
+      <w:r>
+        <w:rPr>
+          <w:rFonts w:ascii="Arial" w:cs="Arial" w:eastAsia="Arial" w:hAnsi="Arial"/>
+          <w:sz w:val="22"/>
+          <w:szCs w:val="22"/>
+        </w:rPr>
+        <w:t xml:space="preserve">Onestitate tehnică: un model găzduit nu atinge latența proprie a Cursor, care folosește modele dedicate cu speculative decoding. Sugestiile noastre apar în aproximativ 1-2 secunde — suficient de bun pentru asistență contextuală reală (verificat live: pentru `def add(a, b)` cu docstring, modelul a propus `return a + b`), dar nu instant per-tastă. Cele două căi AI sunt complet separate: Ghost-ul (Sonnet) reacționează la comportament și biometrice cu intervenții, completările (Haiku) oferă cod local rapid.</w:t>
+      </w:r>
+    </w:p>
+    <w:p>
+      <w:pPr>
+        <w:pBdr>
+          <w:top w:val="dashed" w:color="E94560" w:sz="12" w:space="8"/>
+          <w:bottom w:val="dashed" w:color="E94560" w:sz="12" w:space="8"/>
+          <w:left w:val="dashed" w:color="E94560" w:sz="12" w:space="8"/>
+          <w:right w:val="dashed" w:color="E94560" w:sz="12" w:space="8"/>
+        </w:pBdr>
+        <w:shd w:fill="FFF5F5" w:val="clear"/>
+        <w:spacing w:after="240" w:before="240" w:line="300"/>
+        <w:ind w:left="200" w:right="200"/>
+        <w:jc w:val="center"/>
+      </w:pPr>
+      <w:r>
+        <w:rPr>
+          <w:rFonts w:ascii="Arial" w:cs="Arial" w:eastAsia="Arial" w:hAnsi="Arial"/>
+          <w:b/>
+          <w:bCs/>
+          <w:color w:val="E94560"/>
+          <w:sz w:val="24"/>
+          <w:szCs w:val="24"/>
+        </w:rPr>
+        <w:t xml:space="preserve">📷  SCREENSHOT 25</w:t>
+      </w:r>
+      <w:r>
+        <w:br/>
+      </w:r>
+      <w:r>
+        <w:rPr>
+          <w:rFonts w:ascii="Arial" w:cs="Arial" w:eastAsia="Arial" w:hAnsi="Arial"/>
+          <w:i/>
+          <w:iCs/>
+          <w:color w:val="5A5A5A"/>
+          <w:sz w:val="20"/>
+          <w:szCs w:val="20"/>
+        </w:rPr>
+        <w:t xml:space="preserve">Completare inline ghost text propusă de Claude Haiku în editor, acceptabilă cu Tab.</w:t>
+      </w:r>
+    </w:p>
+    <w:p>
+      <w:pPr>
+        <w:pStyle w:val="Heading2"/>
+        <w:pBdr>
+          <w:left w:val="single" w:color="2E74B5" w:sz="24" w:space="12"/>
+        </w:pBdr>
+        <w:spacing w:after="160" w:before="320"/>
+      </w:pPr>
+      <w:r>
+        <w:rPr>
+          <w:rFonts w:ascii="Arial" w:cs="Arial" w:eastAsia="Arial" w:hAnsi="Arial"/>
+          <w:b/>
+          <w:bCs/>
+          <w:color w:val="1F3864"/>
+          <w:sz w:val="30"/>
+          <w:szCs w:val="30"/>
+        </w:rPr>
+        <w:t xml:space="preserve">3.19. Inteligență de limbaj prin LSP</w:t>
+      </w:r>
+    </w:p>
+    <w:p>
+      <w:pPr>
+        <w:spacing w:after="120" w:line="280"/>
+        <w:jc w:val="both"/>
+      </w:pPr>
+      <w:r>
+        <w:rPr>
+          <w:rFonts w:ascii="Arial" w:cs="Arial" w:eastAsia="Arial" w:hAnsi="Arial"/>
+          <w:sz w:val="22"/>
+          <w:szCs w:val="22"/>
+        </w:rPr>
+        <w:t xml:space="preserve">Pentru inteligență de limbaj reală — diagnostice (squiggles roșii), autocomplete și hover — DevLife conectează editorul la servere de limbaj standard prin Language Server Protocol. Backend-ul (`lsp_bridge.py`) lansează pyright pentru Python sau typescript-language-server pentru JavaScript/TypeScript ca subprocese stdio și face puntea JSON-RPC între ele și browser printr-un WebSocket `/lsp/{language}`, adăugând și eliminând framing-ul Content-Length. Clientul din frontend înregistrează provideri Monaco de completare și hover, răspunde la cererile server→client (de exemplu `workspace/configuration`) și aplică diagnosticele primite ca markere în editor.</w:t>
+      </w:r>
+    </w:p>
+    <w:p>
+      <w:pPr>
+        <w:spacing w:after="120" w:line="280"/>
+        <w:jc w:val="both"/>
+      </w:pPr>
+      <w:r>
+        <w:rPr>
+          <w:rFonts w:ascii="Arial" w:cs="Arial" w:eastAsia="Arial" w:hAnsi="Arial"/>
+          <w:sz w:val="22"/>
+          <w:szCs w:val="22"/>
+        </w:rPr>
+        <w:t xml:space="preserve">Dacă serverul de limbaj nu este instalat local, editorul degradează grațios — funcționează în continuare, doar fără diagnostice și autocomplete LSP. Integrarea a fost verificată live în Chromium: pyright a returnat diagnostice reale și peste 300 de completări prin punte. (Am ales un client LSP focusat în locul migrării la stratul greu de servicii vscode @codingame; go-to-definition între fișiere ar necesita un „editor opener" custom și este în afara scopului actual.)</w:t>
+      </w:r>
+    </w:p>
+    <w:p>
+      <w:pPr>
+        <w:pBdr>
+          <w:top w:val="dashed" w:color="E94560" w:sz="12" w:space="8"/>
+          <w:bottom w:val="dashed" w:color="E94560" w:sz="12" w:space="8"/>
+          <w:left w:val="dashed" w:color="E94560" w:sz="12" w:space="8"/>
+          <w:right w:val="dashed" w:color="E94560" w:sz="12" w:space="8"/>
+        </w:pBdr>
+        <w:shd w:fill="FFF5F5" w:val="clear"/>
+        <w:spacing w:after="240" w:before="240" w:line="300"/>
+        <w:ind w:left="200" w:right="200"/>
+        <w:jc w:val="center"/>
+      </w:pPr>
+      <w:r>
+        <w:rPr>
+          <w:rFonts w:ascii="Arial" w:cs="Arial" w:eastAsia="Arial" w:hAnsi="Arial"/>
+          <w:b/>
+          <w:bCs/>
+          <w:color w:val="E94560"/>
+          <w:sz w:val="24"/>
+          <w:szCs w:val="24"/>
+        </w:rPr>
+        <w:t xml:space="preserve">📷  SCREENSHOT 26</w:t>
+      </w:r>
+      <w:r>
+        <w:br/>
+      </w:r>
+      <w:r>
+        <w:rPr>
+          <w:rFonts w:ascii="Arial" w:cs="Arial" w:eastAsia="Arial" w:hAnsi="Arial"/>
+          <w:i/>
+          <w:iCs/>
+          <w:color w:val="5A5A5A"/>
+          <w:sz w:val="20"/>
+          <w:szCs w:val="20"/>
+        </w:rPr>
+        <w:t xml:space="preserve">Diagnostice LSP (squiggles roșii) și popup de autocomplete pyright în editorul din joc.</w:t>
+      </w:r>
+    </w:p>
+    <w:p>
+      <w:pPr>
         <w:pStyle w:val="Heading1"/>
         <w:pageBreakBefore/>
         <w:pBdr>
@@ -4059,7 +4455,7 @@
           <w:sz w:val="22"/>
           <w:szCs w:val="22"/>
         </w:rPr>
-        <w:t xml:space="preserve">Autentificarea cu WHOOP folosește fluxul OAuth 2.0 standard. Endpoint-ul `/api/whoop/auth` construiește URL-ul de autorizare cu parametrul `state` setat la o valoare cunoscută (`devlife_whoop_auth_2026`) pentru protecție CSRF. Utilizatorul autorizează în interfața WHOOP, iar redirect-ul se întoarce la `/api/whoop/callback` cu codul. Schimbarea codului pe token, refresh-ul tokenului expirat (cu marjă de 60 de secunde înainte de expirare), și persistarea token-urilor în fișierul `.whoop_tokens.json` (gitignored) sunt toate gestionate de clasa `BiometricEngine`.</w:t>
+        <w:t xml:space="preserve">Autentificarea cu WHOOP folosește fluxul OAuth 2.0 standard. Endpoint-ul `/api/whoop/auth` generează un parametru `state` aleator și de unică folosință (prin `secrets`), pe care `/api/whoop/callback` îl validează și îl consumă — protecție CSRF reală, nu o constantă cunoscută. Scope-urile cerute includ `offline`, obligatoriu pentru ca WHOOP să emită un refresh token (fără el conexiunea ar muri după ~1h). Schimbarea codului pe token, refresh-ul tokenului expirat (cu marjă de 60 de secunde și re-trimiterea scope-ului `offline`) și persistarea token-urilor în `.whoop_tokens.json` (gitignored, reîncărcat automat la pornire) sunt gestionate de clasa `BiometricEngine`.</w:t>
       </w:r>
     </w:p>
     <w:p>
@@ -4094,6 +4490,54 @@
           <w:szCs w:val="22"/>
         </w:rPr>
         <w:t xml:space="preserve">Toate query-urile SQL folosesc parameter binding cu caracterul `?` și argumente separate, niciodată concatenare de string-uri sau formatare cu f-strings. Acest pattern elimină complet clasa de vulnerabilități SQL injection. Funcțiile din `persistence/db.py` sunt pure în sensul că primesc input-uri tipizate și produc query-uri parametrizate — nu există funcții care construiesc dinamic SQL din input neîncrezut. În plus, PRAGMA `journal_mode=WAL` oferă citiri concurente non-blocking, util pentru istoricul cerut de UI în timp ce thread-urile scriu sample-uri biometrice.</w:t>
+      </w:r>
+    </w:p>
+    <w:p>
+      <w:pPr>
+        <w:pStyle w:val="Heading2"/>
+        <w:pBdr>
+          <w:left w:val="single" w:color="2E74B5" w:sz="24" w:space="12"/>
+        </w:pBdr>
+        <w:spacing w:after="160" w:before="320"/>
+      </w:pPr>
+      <w:r>
+        <w:rPr>
+          <w:rFonts w:ascii="Arial" w:cs="Arial" w:eastAsia="Arial" w:hAnsi="Arial"/>
+          <w:b/>
+          <w:bCs/>
+          <w:color w:val="1F3864"/>
+          <w:sz w:val="30"/>
+          <w:szCs w:val="30"/>
+        </w:rPr>
+        <w:t xml:space="preserve">4.8. Endpoint-uri locale privilegiate (token + Origin + workspace)</w:t>
+      </w:r>
+    </w:p>
+    <w:p>
+      <w:pPr>
+        <w:spacing w:after="120" w:line="280"/>
+        <w:jc w:val="both"/>
+      </w:pPr>
+      <w:r>
+        <w:rPr>
+          <w:rFonts w:ascii="Arial" w:cs="Arial" w:eastAsia="Arial" w:hAnsi="Arial"/>
+          <w:sz w:val="22"/>
+          <w:szCs w:val="22"/>
+        </w:rPr>
+        <w:t xml:space="preserve">Capabilitățile reale noi — terminal, fișiere, LSP, completări inline — expun shell adevărat, scriere pe disc și subprocese pe localhost. Fără apărare, orice pagină web deschisă în browserul utilizatorului ar putea face WebSocket către `localhost` și obține un shell. Trei straturi previn asta. Întâi, backend-ul ascultă implicit doar pe `127.0.0.1` — fără expunere în LAN. Al doilea, fiecare handshake WebSocket verifică antetul Origin față de `ALLOWED_ORIGINS`; browserele trimit întotdeauna Origin și JS nu îl poate falsifica, deci un site malițios este respins (CORS nu acoperă WebSocket-urile).</w:t>
+      </w:r>
+    </w:p>
+    <w:p>
+      <w:pPr>
+        <w:spacing w:after="120" w:line="280"/>
+        <w:jc w:val="both"/>
+      </w:pPr>
+      <w:r>
+        <w:rPr>
+          <w:rFonts w:ascii="Arial" w:cs="Arial" w:eastAsia="Arial" w:hAnsi="Arial"/>
+          <w:sz w:val="22"/>
+          <w:szCs w:val="22"/>
+        </w:rPr>
+        <w:t xml:space="preserve">Al treilea, un token de sesiune generat per-proces (`secrets.token_urlsafe`) este citit o singură dată din `/api/session` — răspuns pe care CORS îl face necitibil de către alte origini, deci doar aplicația legitimă îl obține — și atașat la fiecare apel privilegiat: ca parametru `?token=` pentru WebSocket-uri (browserele nu pot seta antete pe conexiunile WS) și ca antet `X-DevLife-Token` pentru HTTP. În plus, funcția `resolve_in_workspace()` rezolvă orice cale și garantează că rămâne sub `WORKSPACE_ROOT`, blocând și symlink-urile care ar încerca să iasă. Pe deploy găzduit, toate aceste funcții se opresc prin flag-urile `TERMINAL_ENABLED` / `FILES_ENABLED` / `LSP_ENABLED` / `INLINE_AI_ENABLED`, lăsând activ doar nucleul de companion biometric.</w:t>
       </w:r>
     </w:p>
     <w:p>
@@ -4480,7 +4924,7 @@
         </w:rPr>
         <w:t xml:space="preserve">curl http://localhost:8000/health   # {"status":"alive","ghost":"watching"}
 curl http://localhost:8000/ready    # {"ready":true,...}
-python3 -m pytest tests/ -q          # 37 passed</w:t>
+python3 -m pytest tests/ -q          # 71 passed</w:t>
       </w:r>
     </w:p>
     <w:p>
@@ -4916,7 +5360,7 @@
           <w:sz w:val="22"/>
           <w:szCs w:val="22"/>
         </w:rPr>
-        <w:t xml:space="preserve">Monaco Editor a fost ales pentru aplicația CodeEditor in-game pentru că este același editor folosit în Visual Studio Code — sintaxă highlight, autocomplete, multi-cursor, suport pentru zeci de limbaje — dar embeddable în pagina web. Această alegere oferă utilizatorului o experiență identică cu cea dintr-un IDE real, ceea ce maximizează imersiunea în scenariile demo. Alternativele considerate (CodeMirror, Ace) ar fi fost mai ușoare ca payload, dar ar fi creat o discrepanță vizuală evidentă față de uneltele cu care dezvoltatorii lucrează zilnic.</w:t>
+        <w:t xml:space="preserve">Monaco Editor a fost ales pentru aplicația CodeEditor in-game pentru că este același editor folosit în Visual Studio Code — sintaxă highlight, autocomplete, multi-cursor, suport pentru zeci de limbaje — dar embeddable în pagina web. Este acum împachetat local ca ESM (nu mai este încărcat de pe CDN), ceea ce face IDE-ul să funcționeze complet offline și permite înregistrarea de provideri proprii pentru completări inline AI și pentru LSP. Alternativa CodeMirror 6 ar fi fost mai ușoară ca payload, dar Monaco oferă out-of-the-box experiența de IntelliSense identică cu VS Code, esențială pentru ca editorul din joc să fie un IDE real, nu o jucărie.</w:t>
       </w:r>
     </w:p>
     <w:p>
@@ -4935,21 +5379,21 @@
           <w:sz w:val="26"/>
           <w:szCs w:val="26"/>
         </w:rPr>
-        <w:t xml:space="preserve">Howler</w:t>
-      </w:r>
-    </w:p>
-    <w:p>
-      <w:pPr>
-        <w:spacing w:after="120" w:line="280"/>
-        <w:jc w:val="both"/>
-      </w:pPr>
-      <w:r>
-        <w:rPr>
-          <w:rFonts w:ascii="Arial" w:cs="Arial" w:eastAsia="Arial" w:hAnsi="Arial"/>
-          <w:sz w:val="22"/>
-          <w:szCs w:val="22"/>
-        </w:rPr>
-        <w:t xml:space="preserve">Howler a fost ales ca bibliotecă audio pentru Web Audio API pentru cross-browser compatibility și API-ul simplu. Gestionează muzica ambientală (când și dacă este disponibilă) și efectele Ghost-ului. Alegerea unei biblioteci dedicate, nu a Web Audio API direct, permite gestiunea elegantă a load error-ilor — dacă fișierul ambient lipsește, Howler raportează printr-un callback `onloaderror` și aplicația continuă silent fără să cadă. Volum master este controlabil din Settings și persistat în localStorage.</w:t>
+        <w:t xml:space="preserve">xterm.js + PTY (terminal real)</w:t>
+      </w:r>
+    </w:p>
+    <w:p>
+      <w:pPr>
+        <w:spacing w:after="120" w:line="280"/>
+        <w:jc w:val="both"/>
+      </w:pPr>
+      <w:r>
+        <w:rPr>
+          <w:rFonts w:ascii="Arial" w:cs="Arial" w:eastAsia="Arial" w:hAnsi="Arial"/>
+          <w:sz w:val="22"/>
+          <w:szCs w:val="22"/>
+        </w:rPr>
+        <w:t xml:space="preserve">Pentru terminalul real, xterm.js a fost ales pe frontend pentru că este același emulator de terminal din VS Code — gestionează corect secvențele ANSI, aplicațiile full-screen și redimensionarea. Pe backend, modulul `pty` din biblioteca standard Python a fost preferat în locul unor dependențe externe (ptyprocess, pexpect, node-pty): oferă acces direct la pseudo-terminal fără dependențe terțe și fără un sidecar Node. Combinația dă un shell autentic în browser, peste un singur WebSocket binar.</w:t>
       </w:r>
     </w:p>
     <w:p>
@@ -4968,6 +5412,105 @@
           <w:sz w:val="26"/>
           <w:szCs w:val="26"/>
         </w:rPr>
+        <w:t xml:space="preserve">Claude Haiku 4.5 (completări inline)</w:t>
+      </w:r>
+    </w:p>
+    <w:p>
+      <w:pPr>
+        <w:spacing w:after="120" w:line="280"/>
+        <w:jc w:val="both"/>
+      </w:pPr>
+      <w:r>
+        <w:rPr>
+          <w:rFonts w:ascii="Arial" w:cs="Arial" w:eastAsia="Arial" w:hAnsi="Arial"/>
+          <w:sz w:val="22"/>
+          <w:szCs w:val="22"/>
+        </w:rPr>
+        <w:t xml:space="preserve">Pentru completările inline de tip Cursor a fost ales Claude Haiku 4.5, nu Sonnet 4: la ghost-text contează latența, nu reasoning-ul profund, iar Haiku este semnificativ mai rapid și mai ieftin pentru output scurt. Astfel, cele două căi AI folosesc modelul potrivit fiecărei sarcini — Sonnet pentru intervențiile Ghost (analiză și decizie), Haiku pentru completări (viteză). Promptul de tip fill-in-the-middle, `max_tokens` mic, stop sequences și streaming-ul mențin latența cât mai jos posibil pe un API găzduit.</w:t>
+      </w:r>
+    </w:p>
+    <w:p>
+      <w:pPr>
+        <w:pStyle w:val="Heading3"/>
+        <w:spacing w:after="120" w:before="260"/>
+      </w:pPr>
+      <w:r>
+        <w:rPr>
+          <w:rFonts w:ascii="Arial" w:cs="Arial" w:eastAsia="Arial" w:hAnsi="Arial"/>
+          <w:b/>
+          <w:bCs/>
+          <w:i/>
+          <w:iCs/>
+          <w:color w:val="548DD4"/>
+          <w:sz w:val="26"/>
+          <w:szCs w:val="26"/>
+        </w:rPr>
+        <w:t xml:space="preserve">pyright / typescript-language-server (LSP)</w:t>
+      </w:r>
+    </w:p>
+    <w:p>
+      <w:pPr>
+        <w:spacing w:after="120" w:line="280"/>
+        <w:jc w:val="both"/>
+      </w:pPr>
+      <w:r>
+        <w:rPr>
+          <w:rFonts w:ascii="Arial" w:cs="Arial" w:eastAsia="Arial" w:hAnsi="Arial"/>
+          <w:sz w:val="22"/>
+          <w:szCs w:val="22"/>
+        </w:rPr>
+        <w:t xml:space="preserve">Pentru inteligența de limbaj au fost alese servere LSP standard, mature: pyright (Microsoft) pentru Python și typescript-language-server pentru JS/TS. Reutilizarea protocolului LSP înseamnă diagnostice, completare și hover de calitate de producție fără a reimplementa analiza de limbaj. Puntea este pură Python (`asyncio.create_subprocess_exec` + framing JSON-RPC), fără un bridge Node, fiindcă backend-ul este deja Python. Serverele sunt opționale: dacă lipsesc, editorul degradează grațios.</w:t>
+      </w:r>
+    </w:p>
+    <w:p>
+      <w:pPr>
+        <w:pStyle w:val="Heading3"/>
+        <w:spacing w:after="120" w:before="260"/>
+      </w:pPr>
+      <w:r>
+        <w:rPr>
+          <w:rFonts w:ascii="Arial" w:cs="Arial" w:eastAsia="Arial" w:hAnsi="Arial"/>
+          <w:b/>
+          <w:bCs/>
+          <w:i/>
+          <w:iCs/>
+          <w:color w:val="548DD4"/>
+          <w:sz w:val="26"/>
+          <w:szCs w:val="26"/>
+        </w:rPr>
+        <w:t xml:space="preserve">Howler</w:t>
+      </w:r>
+    </w:p>
+    <w:p>
+      <w:pPr>
+        <w:spacing w:after="120" w:line="280"/>
+        <w:jc w:val="both"/>
+      </w:pPr>
+      <w:r>
+        <w:rPr>
+          <w:rFonts w:ascii="Arial" w:cs="Arial" w:eastAsia="Arial" w:hAnsi="Arial"/>
+          <w:sz w:val="22"/>
+          <w:szCs w:val="22"/>
+        </w:rPr>
+        <w:t xml:space="preserve">Howler a fost ales ca bibliotecă audio pentru Web Audio API pentru cross-browser compatibility și API-ul simplu. Gestionează muzica ambientală (când și dacă este disponibilă) și efectele Ghost-ului. Alegerea unei biblioteci dedicate, nu a Web Audio API direct, permite gestiunea elegantă a load error-ilor — dacă fișierul ambient lipsește, Howler raportează printr-un callback `onloaderror` și aplicația continuă silent fără să cadă. Volum master este controlabil din Settings și persistat în localStorage.</w:t>
+      </w:r>
+    </w:p>
+    <w:p>
+      <w:pPr>
+        <w:pStyle w:val="Heading3"/>
+        <w:spacing w:after="120" w:before="260"/>
+      </w:pPr>
+      <w:r>
+        <w:rPr>
+          <w:rFonts w:ascii="Arial" w:cs="Arial" w:eastAsia="Arial" w:hAnsi="Arial"/>
+          <w:b/>
+          <w:bCs/>
+          <w:i/>
+          <w:iCs/>
+          <w:color w:val="548DD4"/>
+          <w:sz w:val="26"/>
+          <w:szCs w:val="26"/>
+        </w:rPr>
         <w:t xml:space="preserve">slowapi</w:t>
       </w:r>
     </w:p>
@@ -5071,7 +5614,7 @@
           <w:sz w:val="22"/>
           <w:szCs w:val="22"/>
         </w:rPr>
-        <w:t xml:space="preserve">Când am preluat backend-ul, am găsit un prototip funcțional dar fragil — globale împrăștiate, fără teste, callback-ul OAuth WHOOP rupt, niciun control de securitate. L-am refactorizat sistematic, fără să schimb produsul: am încapsulat tot state-ul într-un `AppState` dataclass, am adăugat validare Pydantic, am construit persistența SQLite, am scris auditul pentru Apply Fix. Cele 37 de teste pytest au apărut pentru că într-un sistem cu intervenții AI care propun modificări de cod, fiecare path critic trebuie verificat — un bug în validatorul de patch ar putea însemna executarea de cod arbitrar. Felul în care biometricele utilizatorului se transformă în intervenții AI cu rollback complet — acesta este scheletul pe care DevLife poate construi mai departe. Pentru un dezvoltator care lucrează singur în nopți târzii, este diferența între un `git push --force` regretabil și un Save Draft. Acest decalaj este, pe termen lung, ceea ce face diferența între un produs care „arată bine" și unul care chiar contează.</w:t>
+        <w:t xml:space="preserve">Când am preluat backend-ul, am găsit un prototip funcțional dar fragil — globale împrăștiate, fără teste, callback-ul OAuth WHOOP rupt, niciun control de securitate. L-am refactorizat sistematic, fără să schimb produsul: am încapsulat tot state-ul într-un `AppState` dataclass, am adăugat validare Pydantic, am construit persistența SQLite, am scris auditul pentru Apply Fix. Cele 71 de teste pytest au apărut pentru că într-un sistem cu intervenții AI care propun modificări de cod, fiecare path critic trebuie verificat — un bug în validatorul de patch ar putea însemna executarea de cod arbitrar. Felul în care biometricele utilizatorului se transformă în intervenții AI cu rollback complet — acesta este scheletul pe care DevLife poate construi mai departe. Pentru un dezvoltator care lucrează singur în nopți târzii, este diferența între un `git push --force` regretabil și un Save Draft. Acest decalaj este, pe termen lung, ceea ce face diferența între un produs care „arată bine" și unul care chiar contează.</w:t>
       </w:r>
     </w:p>
     <w:p>
@@ -5344,6 +5887,20 @@
           <w:szCs w:val="30"/>
         </w:rPr>
         <w:t xml:space="preserve">8.2. Roadmap pe termen scurt</w:t>
+      </w:r>
+    </w:p>
+    <w:p>
+      <w:pPr>
+        <w:spacing w:after="120" w:line="280"/>
+        <w:jc w:val="both"/>
+      </w:pPr>
+      <w:r>
+        <w:rPr>
+          <w:rFonts w:ascii="Arial" w:cs="Arial" w:eastAsia="Arial" w:hAnsi="Arial"/>
+          <w:sz w:val="22"/>
+          <w:szCs w:val="22"/>
+        </w:rPr>
+        <w:t xml:space="preserve">Față de versiunea v1.1, iterația curentă a transformat trei funcționalități din simulate în reale: conexiunea WHOOP cu persistența corectă a tokenului, editorul care editează fișiere reale (IDE complet cu Monaco bundle-uit, file tree, taburi, salvare), terminalul prin PTY real, plus completări AI inline (Haiku) și inteligență de limbaj prin LSP (pyright/tsserver). Roadmap-ul de mai jos privește pașii următori peste această fundație.</w:t>
       </w:r>
     </w:p>
     <w:p>

</xml_diff>

<commit_message>
docs: regenerate final DOCX with C++ runner + Spotify sections
- new section 3.20: in-browser C++ runner via JSCPP (supported headers,
    trade-off vs WASM clang, integration with run_error pipeline)
  - new section 3.21: Spotify Web Playback SDK + PKCE OAuth integration
    (opt-in design, procedural pad fallback when client_id unset)
  - chapter 10: JSCPP, xterm.js, watchfiles, Spotify SDK declared as resources
  - test count synced 71 -> 75 across chapters 2.7, 5.4, 7.2
</commit_message>
<xml_diff>
--- a/documentatie-finala.docx
+++ b/documentatie-finala.docx
@@ -1039,7 +1039,7 @@
           <w:sz w:val="22"/>
           <w:szCs w:val="22"/>
         </w:rPr>
-        <w:t xml:space="preserve">Suita de teste numără 71 de teste pytest. Nucleul original acoperă logica de business: `test_apply_fix.py` (contract, validator, lifecycle preview-confirm-rollback), `test_biometric_classifier.py` (toate cele cinci stări cognitive și callback-ul de schimbare a stării), `test_fallback.py` (răspunsuri pre-cached și mock biometric reproductibil), `test_server_smoke.py` (endpoint-uri HTTP + factory de analyzer), `test_ws_flow.py` și `test_run_error_routing.py` (fluxul WebSocket de la connect la mesaje validate). Capabilitățile reale noi au propriile suite: `test_security.py` (path-traversal, token, Origin, CSRF), `test_whoop_tokens.py` (persistența tokenului + scope-ul offline), `test_terminal_pty.py` / `test_terminal_ws.py` (PTY real, gating, echo), `test_file_api.py` (I/O în workspace + gating), `test_inline_ws.py` (streaming completări) și `test_lsp_bridge.py` (handshake real pyright).</w:t>
+        <w:t xml:space="preserve">Suita de teste numără 75 de teste pytest. Nucleul original acoperă logica de business: `test_apply_fix.py` (contract, validator, lifecycle preview-confirm-rollback), `test_biometric_classifier.py` (toate cele cinci stări cognitive și callback-ul de schimbare a stării), `test_fallback.py` (răspunsuri pre-cached și mock biometric reproductibil), `test_server_smoke.py` (endpoint-uri HTTP + factory de analyzer), `test_ws_flow.py` și `test_run_error_routing.py` (fluxul WebSocket de la connect la mesaje validate). Capabilitățile reale noi au propriile suite: `test_security.py` (path-traversal, token, Origin, CSRF), `test_whoop_tokens.py` (persistența tokenului + scope-ul offline), `test_terminal_pty.py` / `test_terminal_ws.py` (PTY real, gating, echo), `test_file_api.py` (I/O în workspace + gating), `test_inline_ws.py` (streaming completări) și `test_lsp_bridge.py` (handshake real pyright).</w:t>
       </w:r>
     </w:p>
     <w:p>
@@ -4207,6 +4207,194 @@
     </w:p>
     <w:p>
       <w:pPr>
+        <w:pStyle w:val="Heading2"/>
+        <w:pBdr>
+          <w:left w:val="single" w:color="2E74B5" w:sz="24" w:space="12"/>
+        </w:pBdr>
+        <w:spacing w:after="160" w:before="320"/>
+      </w:pPr>
+      <w:r>
+        <w:rPr>
+          <w:rFonts w:ascii="Arial" w:cs="Arial" w:eastAsia="Arial" w:hAnsi="Arial"/>
+          <w:b/>
+          <w:bCs/>
+          <w:color w:val="1F3864"/>
+          <w:sz w:val="30"/>
+          <w:szCs w:val="30"/>
+        </w:rPr>
+        <w:t xml:space="preserve">3.20. Rularea codului C++ în browser — JSCPP</w:t>
+      </w:r>
+    </w:p>
+    <w:p>
+      <w:pPr>
+        <w:spacing w:after="120" w:line="280"/>
+        <w:jc w:val="both"/>
+      </w:pPr>
+      <w:r>
+        <w:rPr>
+          <w:rFonts w:ascii="Arial" w:cs="Arial" w:eastAsia="Arial" w:hAnsi="Arial"/>
+          <w:sz w:val="22"/>
+          <w:szCs w:val="22"/>
+        </w:rPr>
+        <w:t xml:space="preserve">Pe lângă Python (Pyodide) și JavaScript (Web Worker nativ), editorul rulează acum și C++ direct în browser, fără compilator local și fără apel către un serviciu extern. Integrarea folosește JSCPP, un interpret C++ scris în întregime în JavaScript, împachetat de Vite ca module worker (`frontend/src/apps/runners/cppWorker.js`). La click pe Run, codul sursă este trimis worker-ului împreună cu stdin-ul, interpretat sincron sub o limită internă `maxTimeout: 5000ms` și returnat ca `{stdout, stderr, exit, ms}` — exact aceeași formă ca runner-ele Python și JavaScript. Worker-ul rulează izolat: dacă utilizatorul scrie o buclă infinită sau o eroare de runtime, doar firul worker-ului este afectat, nu UI-ul jocului.</w:t>
+      </w:r>
+    </w:p>
+    <w:p>
+      <w:pPr>
+        <w:spacing w:after="120" w:line="280"/>
+        <w:jc w:val="both"/>
+      </w:pPr>
+      <w:r>
+        <w:rPr>
+          <w:rFonts w:ascii="Arial" w:cs="Arial" w:eastAsia="Arial" w:hAnsi="Arial"/>
+          <w:sz w:val="22"/>
+          <w:szCs w:val="22"/>
+        </w:rPr>
+        <w:t xml:space="preserve">Trade-off-ul ales conștient: JSCPP suportă un subset al C++ (header-ele `&lt;iostream&gt;`, `&lt;cmath&gt;`, `&lt;cstdio&gt;`, `&lt;cstdlib&gt;`, `&lt;cstring&gt;`, `&lt;ctime&gt;`, `&lt;iomanip&gt;`, `&lt;cctype&gt;`, plus clase, pointeri și aritmetică standard), dar nu containere STL ca `&lt;vector&gt;` sau `&lt;string&gt;`. Pentru programe stil olimpiadă (algoritmi, citire din stdin, calcul matematic) acoperirea este suficientă. Alternativa — clang compilat în WebAssembly (~30-50 MB download) — ar fi oferit suport STL complet, dar cu un UX inacceptabil la prima rulare. Codul sursă conține deja un comentariu explicit cu lista exactă a header-elor suportate, deci utilizatorul știe instant ce funcționează. Erorile de runtime (de exemplu dereferențierea unui pointer nul) sunt rutate prin același pipeline `run_error` → Ghost intervention ca pentru Python și JavaScript — diagnosticarea este uniformă indiferent de limbaj.</w:t>
+      </w:r>
+    </w:p>
+    <w:p>
+      <w:pPr>
+        <w:pBdr>
+          <w:top w:val="dashed" w:color="E94560" w:sz="12" w:space="8"/>
+          <w:bottom w:val="dashed" w:color="E94560" w:sz="12" w:space="8"/>
+          <w:left w:val="dashed" w:color="E94560" w:sz="12" w:space="8"/>
+          <w:right w:val="dashed" w:color="E94560" w:sz="12" w:space="8"/>
+        </w:pBdr>
+        <w:shd w:fill="FFF5F5" w:val="clear"/>
+        <w:spacing w:after="240" w:before="240" w:line="300"/>
+        <w:ind w:left="200" w:right="200"/>
+        <w:jc w:val="center"/>
+      </w:pPr>
+      <w:r>
+        <w:rPr>
+          <w:rFonts w:ascii="Arial" w:cs="Arial" w:eastAsia="Arial" w:hAnsi="Arial"/>
+          <w:b/>
+          <w:bCs/>
+          <w:color w:val="E94560"/>
+          <w:sz w:val="24"/>
+          <w:szCs w:val="24"/>
+        </w:rPr>
+        <w:t xml:space="preserve">📷  SCREENSHOT 27</w:t>
+      </w:r>
+      <w:r>
+        <w:br/>
+      </w:r>
+      <w:r>
+        <w:rPr>
+          <w:rFonts w:ascii="Arial" w:cs="Arial" w:eastAsia="Arial" w:hAnsi="Arial"/>
+          <w:i/>
+          <w:iCs/>
+          <w:color w:val="5A5A5A"/>
+          <w:sz w:val="20"/>
+          <w:szCs w:val="20"/>
+        </w:rPr>
+        <w:t xml:space="preserve">Editor cu welcome.cpp deschis, buton Run apăsat, output `sum = 31` în panoul de stdout.</w:t>
+      </w:r>
+    </w:p>
+    <w:p>
+      <w:pPr>
+        <w:pStyle w:val="Heading2"/>
+        <w:pBdr>
+          <w:left w:val="single" w:color="2E74B5" w:sz="24" w:space="12"/>
+        </w:pBdr>
+        <w:spacing w:after="160" w:before="320"/>
+      </w:pPr>
+      <w:r>
+        <w:rPr>
+          <w:rFonts w:ascii="Arial" w:cs="Arial" w:eastAsia="Arial" w:hAnsi="Arial"/>
+          <w:b/>
+          <w:bCs/>
+          <w:color w:val="1F3864"/>
+          <w:sz w:val="30"/>
+          <w:szCs w:val="30"/>
+        </w:rPr>
+        <w:t xml:space="preserve">3.21. Boxa muzicală conectată la Spotify — PKCE OAuth + Web Playback SDK</w:t>
+      </w:r>
+    </w:p>
+    <w:p>
+      <w:pPr>
+        <w:spacing w:after="120" w:line="280"/>
+        <w:jc w:val="both"/>
+      </w:pPr>
+      <w:r>
+        <w:rPr>
+          <w:rFonts w:ascii="Arial" w:cs="Arial" w:eastAsia="Arial" w:hAnsi="Arial"/>
+          <w:sz w:val="22"/>
+          <w:szCs w:val="22"/>
+        </w:rPr>
+        <w:t xml:space="preserve">Boxa din cameră (sprite-ul de lângă birou) servește dublu rol: când utilizatorul nu este conectat la Spotify, click pe ea pornește/oprește un pad procedural sintetizat cu Web Audio API (oscilatori cu detune ușor, LFO, filtru lowpass — niciun fișier audio extern, totul generat dinamic). Când utilizatorul își conectează contul Spotify Premium din meniul Settings, aceeași boxă devine un control play/pause pentru contul personal: redarea continuă pe un device virtual numit „DevLife — room speaker", vizibil și în aplicația Spotify oficială alături de telefon și desktop.</w:t>
+      </w:r>
+    </w:p>
+    <w:p>
+      <w:pPr>
+        <w:spacing w:after="120" w:line="280"/>
+        <w:jc w:val="both"/>
+      </w:pPr>
+      <w:r>
+        <w:rPr>
+          <w:rFonts w:ascii="Arial" w:cs="Arial" w:eastAsia="Arial" w:hAnsi="Arial"/>
+          <w:sz w:val="22"/>
+          <w:szCs w:val="22"/>
+        </w:rPr>
+        <w:t xml:space="preserve">Autentificarea folosește OAuth 2.0 cu PKCE (Authorization Code + Proof Key for Code Exchange, RFC 7636) — alegerea corectă pentru un Single-Page Application care nu poate stoca secrete. Frontend-ul generează un `code_verifier` aleator de 64 de caractere și un `state` random anti-CSRF, calculează provocarea SHA-256 din verifier și redirecționează către accounts.spotify.com. La întoarcerea cu `?code=`, browser-ul schimbă codul pe access_token + refresh_token printr-un POST direct la `accounts.spotify.com/api/token`, fără ca backend-ul DevLife să atingă vreodată token-urile. Toate apelurile API (transfer playback, play/pause) reîmprospătează transparent token-ul la 401, iar slider-ul de volum și butonul Mute din Settings controlează simultan pad-ul procedural și volumul SDK-ului Spotify.</w:t>
+      </w:r>
+    </w:p>
+    <w:p>
+      <w:pPr>
+        <w:spacing w:after="120" w:line="280"/>
+        <w:jc w:val="both"/>
+      </w:pPr>
+      <w:r>
+        <w:rPr>
+          <w:rFonts w:ascii="Arial" w:cs="Arial" w:eastAsia="Arial" w:hAnsi="Arial"/>
+          <w:sz w:val="22"/>
+          <w:szCs w:val="22"/>
+        </w:rPr>
+        <w:t xml:space="preserve">Design intenționat: dacă variabila `VITE_SPOTIFY_CLIENT_ID` nu este setată în `.env`, întreaga secțiune Spotify dispare din meniu și boxa rămâne pe pad-ul procedural — zero regresie pentru utilizatorii care nu doresc integrarea sau nu au Spotify Premium. Setup-ul complet (înregistrare app la developer.spotify.com, configurare redirect URI, completare client_id) este documentat în `docs/spotify-setup.md`.</w:t>
+      </w:r>
+    </w:p>
+    <w:p>
+      <w:pPr>
+        <w:pBdr>
+          <w:top w:val="dashed" w:color="E94560" w:sz="12" w:space="8"/>
+          <w:bottom w:val="dashed" w:color="E94560" w:sz="12" w:space="8"/>
+          <w:left w:val="dashed" w:color="E94560" w:sz="12" w:space="8"/>
+          <w:right w:val="dashed" w:color="E94560" w:sz="12" w:space="8"/>
+        </w:pBdr>
+        <w:shd w:fill="FFF5F5" w:val="clear"/>
+        <w:spacing w:after="240" w:before="240" w:line="300"/>
+        <w:ind w:left="200" w:right="200"/>
+        <w:jc w:val="center"/>
+      </w:pPr>
+      <w:r>
+        <w:rPr>
+          <w:rFonts w:ascii="Arial" w:cs="Arial" w:eastAsia="Arial" w:hAnsi="Arial"/>
+          <w:b/>
+          <w:bCs/>
+          <w:color w:val="E94560"/>
+          <w:sz w:val="24"/>
+          <w:szCs w:val="24"/>
+        </w:rPr>
+        <w:t xml:space="preserve">📷  SCREENSHOT 28</w:t>
+      </w:r>
+      <w:r>
+        <w:br/>
+      </w:r>
+      <w:r>
+        <w:rPr>
+          <w:rFonts w:ascii="Arial" w:cs="Arial" w:eastAsia="Arial" w:hAnsi="Arial"/>
+          <w:i/>
+          <w:iCs/>
+          <w:color w:val="5A5A5A"/>
+          <w:sz w:val="20"/>
+          <w:szCs w:val="20"/>
+        </w:rPr>
+        <w:t xml:space="preserve">Meniul Settings cu secțiunea SPOTIFY: status „Connected as Matei Vultur" și buton Disconnect; alături, boxa pulsantă din cameră.</w:t>
+      </w:r>
+    </w:p>
+    <w:p>
+      <w:pPr>
         <w:pStyle w:val="Heading1"/>
         <w:pageBreakBefore/>
         <w:pBdr>
@@ -4924,7 +5112,7 @@
         </w:rPr>
         <w:t xml:space="preserve">curl http://localhost:8000/health   # {"status":"alive","ghost":"watching"}
 curl http://localhost:8000/ready    # {"ready":true,...}
-python3 -m pytest tests/ -q          # 71 passed</w:t>
+python3 -m pytest tests/ -q          # 75 passed</w:t>
       </w:r>
     </w:p>
     <w:p>
@@ -5614,7 +5802,7 @@
           <w:sz w:val="22"/>
           <w:szCs w:val="22"/>
         </w:rPr>
-        <w:t xml:space="preserve">Când am preluat backend-ul, am găsit un prototip funcțional dar fragil — globale împrăștiate, fără teste, callback-ul OAuth WHOOP rupt, niciun control de securitate. L-am refactorizat sistematic, fără să schimb produsul: am încapsulat tot state-ul într-un `AppState` dataclass, am adăugat validare Pydantic, am construit persistența SQLite, am scris auditul pentru Apply Fix. Cele 71 de teste pytest au apărut pentru că într-un sistem cu intervenții AI care propun modificări de cod, fiecare path critic trebuie verificat — un bug în validatorul de patch ar putea însemna executarea de cod arbitrar. Felul în care biometricele utilizatorului se transformă în intervenții AI cu rollback complet — acesta este scheletul pe care DevLife poate construi mai departe. Pentru un dezvoltator care lucrează singur în nopți târzii, este diferența între un `git push --force` regretabil și un Save Draft. Acest decalaj este, pe termen lung, ceea ce face diferența între un produs care „arată bine" și unul care chiar contează.</w:t>
+        <w:t xml:space="preserve">Când am preluat backend-ul, am găsit un prototip funcțional dar fragil — globale împrăștiate, fără teste, callback-ul OAuth WHOOP rupt, niciun control de securitate. L-am refactorizat sistematic, fără să schimb produsul: am încapsulat tot state-ul într-un `AppState` dataclass, am adăugat validare Pydantic, am construit persistența SQLite, am scris auditul pentru Apply Fix. Cele 75 de teste pytest au apărut pentru că într-un sistem cu intervenții AI care propun modificări de cod, fiecare path critic trebuie verificat — un bug în validatorul de patch ar putea însemna executarea de cod arbitrar. Felul în care biometricele utilizatorului se transformă în intervenții AI cu rollback complet — acesta este scheletul pe care DevLife poate construi mai departe. Pentru un dezvoltator care lucrează singur în nopți târzii, este diferența între un `git push --force` regretabil și un Save Draft. Acest decalaj este, pe termen lung, ceea ce face diferența între un produs care „arată bine" și unul care chiar contează.</w:t>
       </w:r>
     </w:p>
     <w:p>
@@ -6725,26 +6913,6 @@
     </w:p>
     <w:p>
       <w:pPr>
-        <w:pStyle w:val="Heading2"/>
-        <w:pBdr>
-          <w:left w:val="single" w:color="2E74B5" w:sz="24" w:space="12"/>
-        </w:pBdr>
-        <w:spacing w:after="160" w:before="320"/>
-      </w:pPr>
-      <w:r>
-        <w:rPr>
-          <w:rFonts w:ascii="Arial" w:cs="Arial" w:eastAsia="Arial" w:hAnsi="Arial"/>
-          <w:b/>
-          <w:bCs/>
-          <w:color w:val="1F3864"/>
-          <w:sz w:val="30"/>
-          <w:szCs w:val="30"/>
-        </w:rPr>
-        <w:t xml:space="preserve">10.2. Servicii externe (API-uri)</w:t>
-      </w:r>
-    </w:p>
-    <w:p>
-      <w:pPr>
         <w:pStyle w:val="ListParagraph"/>
         <w:numPr>
           <w:ilvl w:val="0"/>
@@ -6758,7 +6926,7 @@
           <w:sz w:val="22"/>
           <w:szCs w:val="22"/>
         </w:rPr>
-        <w:t xml:space="preserve">Anthropic Claude API (Claude Sonnet 4) — declarată în README.md, folosită prin SDK oficial, sub ToS Anthropic</w:t>
+        <w:t xml:space="preserve">JSCPP 2.0.9 — interpret C++ pur JavaScript pentru runner-ul in-browser (MIT)</w:t>
       </w:r>
     </w:p>
     <w:p>
@@ -6776,7 +6944,7 @@
           <w:sz w:val="22"/>
           <w:szCs w:val="22"/>
         </w:rPr>
-        <w:t xml:space="preserve">WHOOP API (OAuth 2.0) — declarată în README.md, folosită prin OAuth standard, sub ToS WHOOP</w:t>
+        <w:t xml:space="preserve">xterm.js + @xterm/addon-fit — emulator terminal in browser (MIT)</w:t>
       </w:r>
     </w:p>
     <w:p>
@@ -6794,7 +6962,99 @@
           <w:sz w:val="22"/>
           <w:szCs w:val="22"/>
         </w:rPr>
+        <w:t xml:space="preserve">watchfiles — watcher de file system pentru reload selectiv (MIT)</w:t>
+      </w:r>
+    </w:p>
+    <w:p>
+      <w:pPr>
+        <w:pStyle w:val="Heading2"/>
+        <w:pBdr>
+          <w:left w:val="single" w:color="2E74B5" w:sz="24" w:space="12"/>
+        </w:pBdr>
+        <w:spacing w:after="160" w:before="320"/>
+      </w:pPr>
+      <w:r>
+        <w:rPr>
+          <w:rFonts w:ascii="Arial" w:cs="Arial" w:eastAsia="Arial" w:hAnsi="Arial"/>
+          <w:b/>
+          <w:bCs/>
+          <w:color w:val="1F3864"/>
+          <w:sz w:val="30"/>
+          <w:szCs w:val="30"/>
+        </w:rPr>
+        <w:t xml:space="preserve">10.2. Servicii externe (API-uri)</w:t>
+      </w:r>
+    </w:p>
+    <w:p>
+      <w:pPr>
+        <w:pStyle w:val="ListParagraph"/>
+        <w:numPr>
+          <w:ilvl w:val="0"/>
+          <w:numId w:val="2"/>
+        </w:numPr>
+        <w:spacing w:after="80" w:line="280"/>
+      </w:pPr>
+      <w:r>
+        <w:rPr>
+          <w:rFonts w:ascii="Arial" w:cs="Arial" w:eastAsia="Arial" w:hAnsi="Arial"/>
+          <w:sz w:val="22"/>
+          <w:szCs w:val="22"/>
+        </w:rPr>
+        <w:t xml:space="preserve">Anthropic Claude API (Claude Sonnet 4) — declarată în README.md, folosită prin SDK oficial, sub ToS Anthropic</w:t>
+      </w:r>
+    </w:p>
+    <w:p>
+      <w:pPr>
+        <w:pStyle w:val="ListParagraph"/>
+        <w:numPr>
+          <w:ilvl w:val="0"/>
+          <w:numId w:val="2"/>
+        </w:numPr>
+        <w:spacing w:after="80" w:line="280"/>
+      </w:pPr>
+      <w:r>
+        <w:rPr>
+          <w:rFonts w:ascii="Arial" w:cs="Arial" w:eastAsia="Arial" w:hAnsi="Arial"/>
+          <w:sz w:val="22"/>
+          <w:szCs w:val="22"/>
+        </w:rPr>
+        <w:t xml:space="preserve">WHOOP API (OAuth 2.0) — declarată în README.md, folosită prin OAuth standard, sub ToS WHOOP</w:t>
+      </w:r>
+    </w:p>
+    <w:p>
+      <w:pPr>
+        <w:pStyle w:val="ListParagraph"/>
+        <w:numPr>
+          <w:ilvl w:val="0"/>
+          <w:numId w:val="2"/>
+        </w:numPr>
+        <w:spacing w:after="80" w:line="280"/>
+      </w:pPr>
+      <w:r>
+        <w:rPr>
+          <w:rFonts w:ascii="Arial" w:cs="Arial" w:eastAsia="Arial" w:hAnsi="Arial"/>
+          <w:sz w:val="22"/>
+          <w:szCs w:val="22"/>
+        </w:rPr>
         <w:t xml:space="preserve">Chrome Web Bluetooth API — caracteristică standard a browser-ului Chrome</w:t>
+      </w:r>
+    </w:p>
+    <w:p>
+      <w:pPr>
+        <w:pStyle w:val="ListParagraph"/>
+        <w:numPr>
+          <w:ilvl w:val="0"/>
+          <w:numId w:val="2"/>
+        </w:numPr>
+        <w:spacing w:after="80" w:line="280"/>
+      </w:pPr>
+      <w:r>
+        <w:rPr>
+          <w:rFonts w:ascii="Arial" w:cs="Arial" w:eastAsia="Arial" w:hAnsi="Arial"/>
+          <w:sz w:val="22"/>
+          <w:szCs w:val="22"/>
+        </w:rPr>
+        <w:t xml:space="preserve">Spotify Web Playback SDK + Web API — integrare opt-in, OAuth 2.0 cu PKCE, sub ToS Spotify</w:t>
       </w:r>
     </w:p>
     <w:p>

</xml_diff>

<commit_message>
docs: drop red H1 underlines + add C++ runner & Spotify sections
- h1(): removed bottom red accent border under chapter titles, replaced
    with plain navy bold text (page break before is kept for breathing room)
  - new section 3.20: in-browser C++ runner via JSCPP (supported headers,
    trade-off vs WASM clang, integration with run_error pipeline)
  - new section 3.21: Spotify Web Playback SDK + PKCE OAuth integration
    (opt-in design, procedural pad fallback when client_id unset)
  - chapter 10: declared JSCPP, xterm.js, watchfiles, Spotify SDK as resources
  - test count synced 71 -> 75 across chapters 2.7, 5.4, 7.2
</commit_message>
<xml_diff>
--- a/documentatie-finala.docx
+++ b/documentatie-finala.docx
@@ -195,9 +195,6 @@
       <w:pPr>
         <w:pStyle w:val="Heading1"/>
         <w:pageBreakBefore/>
-        <w:pBdr>
-          <w:bottom w:val="single" w:color="E94560" w:sz="18" w:space="4"/>
-        </w:pBdr>
         <w:spacing w:after="320" w:before="0"/>
       </w:pPr>
       <w:r>
@@ -235,9 +232,6 @@
       <w:pPr>
         <w:pStyle w:val="Heading1"/>
         <w:pageBreakBefore/>
-        <w:pBdr>
-          <w:bottom w:val="single" w:color="E94560" w:sz="18" w:space="4"/>
-        </w:pBdr>
         <w:spacing w:after="320" w:before="0"/>
       </w:pPr>
       <w:r>
@@ -540,9 +534,6 @@
       <w:pPr>
         <w:pStyle w:val="Heading1"/>
         <w:pageBreakBefore/>
-        <w:pBdr>
-          <w:bottom w:val="single" w:color="E94560" w:sz="18" w:space="4"/>
-        </w:pBdr>
         <w:spacing w:after="320" w:before="0"/>
       </w:pPr>
       <w:r>
@@ -1108,9 +1099,6 @@
       <w:pPr>
         <w:pStyle w:val="Heading1"/>
         <w:pageBreakBefore/>
-        <w:pBdr>
-          <w:bottom w:val="single" w:color="E94560" w:sz="18" w:space="4"/>
-        </w:pBdr>
         <w:spacing w:after="320" w:before="0"/>
       </w:pPr>
       <w:r>
@@ -4397,9 +4385,6 @@
       <w:pPr>
         <w:pStyle w:val="Heading1"/>
         <w:pageBreakBefore/>
-        <w:pBdr>
-          <w:bottom w:val="single" w:color="E94560" w:sz="18" w:space="4"/>
-        </w:pBdr>
         <w:spacing w:after="320" w:before="0"/>
       </w:pPr>
       <w:r>
@@ -4732,9 +4717,6 @@
       <w:pPr>
         <w:pStyle w:val="Heading1"/>
         <w:pageBreakBefore/>
-        <w:pBdr>
-          <w:bottom w:val="single" w:color="E94560" w:sz="18" w:space="4"/>
-        </w:pBdr>
         <w:spacing w:after="320" w:before="0"/>
       </w:pPr>
       <w:r>
@@ -5303,9 +5285,6 @@
       <w:pPr>
         <w:pStyle w:val="Heading1"/>
         <w:pageBreakBefore/>
-        <w:pBdr>
-          <w:bottom w:val="single" w:color="E94560" w:sz="18" w:space="4"/>
-        </w:pBdr>
         <w:spacing w:after="320" w:before="0"/>
       </w:pPr>
       <w:r>
@@ -5720,9 +5699,6 @@
       <w:pPr>
         <w:pStyle w:val="Heading1"/>
         <w:pageBreakBefore/>
-        <w:pBdr>
-          <w:bottom w:val="single" w:color="E94560" w:sz="18" w:space="4"/>
-        </w:pBdr>
         <w:spacing w:after="320" w:before="0"/>
       </w:pPr>
       <w:r>
@@ -5936,9 +5912,6 @@
       <w:pPr>
         <w:pStyle w:val="Heading1"/>
         <w:pageBreakBefore/>
-        <w:pBdr>
-          <w:bottom w:val="single" w:color="E94560" w:sz="18" w:space="4"/>
-        </w:pBdr>
         <w:spacing w:after="320" w:before="0"/>
       </w:pPr>
       <w:r>
@@ -6433,9 +6406,6 @@
       <w:pPr>
         <w:pStyle w:val="Heading1"/>
         <w:pageBreakBefore/>
-        <w:pBdr>
-          <w:bottom w:val="single" w:color="E94560" w:sz="18" w:space="4"/>
-        </w:pBdr>
         <w:spacing w:after="320" w:before="0"/>
       </w:pPr>
       <w:r>
@@ -6608,9 +6578,6 @@
       <w:pPr>
         <w:pStyle w:val="Heading1"/>
         <w:pageBreakBefore/>
-        <w:pBdr>
-          <w:bottom w:val="single" w:color="E94560" w:sz="18" w:space="4"/>
-        </w:pBdr>
         <w:spacing w:after="320" w:before="0"/>
       </w:pPr>
       <w:r>

</xml_diff>